<commit_message>
Integrate UI, map and data persistence with GSAP improvements
</commit_message>
<xml_diff>
--- a/docs/BinGo Project Proposal.docx
+++ b/docs/BinGo Project Proposal.docx
@@ -1613,23 +1613,7 @@
           <w:sz w:val="22"/>
           <w:szCs w:val="22"/>
         </w:rPr>
-        <w:t xml:space="preserve">BinGo is designed to address these systematic challenges by offering a comprehensive platform that encompasses disposal guidance, recycling locations, truck schedules, bulky-waste booking, issue reporting and verified </w:t>
-      </w:r>
-      <w:r>
-        <w:rPr>
-          <w:rFonts w:ascii="Arial" w:hAnsi="Arial" w:cs="Arial"/>
-          <w:sz w:val="22"/>
-          <w:szCs w:val="22"/>
-        </w:rPr>
-        <w:t>Green Points</w:t>
-      </w:r>
-      <w:r>
-        <w:rPr>
-          <w:rFonts w:ascii="Arial" w:hAnsi="Arial" w:cs="Arial"/>
-          <w:sz w:val="22"/>
-          <w:szCs w:val="22"/>
-        </w:rPr>
-        <w:t>—all consolidated within one township framework. Unlike a conventional directory that only lists recycling points, BinGo facilitates specific actions based on item identification, directing residents to the appropriate disposal routes and services while enabling them to track the outcomes of their efforts.</w:t>
+        <w:t>BinGo is designed to address these systematic challenges by offering a comprehensive platform that encompasses disposal guidance, recycling locations, truck schedules, bulky-waste booking, issue reporting and verified eco-rewards—all consolidated within one township framework. Unlike a conventional directory that only lists recycling points, BinGo facilitates specific actions based on item identification, directing residents to the appropriate disposal routes and services while enabling them to track the outcomes of their efforts.</w:t>
       </w:r>
     </w:p>
     <w:p>
@@ -3335,23 +3319,7 @@
           <w:sz w:val="22"/>
           <w:szCs w:val="22"/>
         </w:rPr>
-        <w:t xml:space="preserve">BinGo incorporates an </w:t>
-      </w:r>
-      <w:r>
-        <w:rPr>
-          <w:rFonts w:ascii="Arial" w:hAnsi="Arial" w:cs="Arial"/>
-          <w:sz w:val="22"/>
-          <w:szCs w:val="22"/>
-        </w:rPr>
-        <w:t>Green Points</w:t>
-      </w:r>
-      <w:r>
-        <w:rPr>
-          <w:rFonts w:ascii="Arial" w:hAnsi="Arial" w:cs="Arial"/>
-          <w:sz w:val="22"/>
-          <w:szCs w:val="22"/>
-        </w:rPr>
-        <w:t xml:space="preserve"> mechanism to encourage sustained participation in eligible recycling and reuse activities.</w:t>
+        <w:t>BinGo incorporates an eco-rewards mechanism to encourage sustained participation in eligible recycling and reuse activities.</w:t>
       </w:r>
     </w:p>
     <w:p>
@@ -5026,23 +4994,7 @@
           <w:sz w:val="22"/>
           <w:szCs w:val="22"/>
         </w:rPr>
-        <w:t xml:space="preserve">Its proposed </w:t>
-      </w:r>
-      <w:r>
-        <w:rPr>
-          <w:rFonts w:ascii="Arial" w:hAnsi="Arial" w:cs="Arial"/>
-          <w:sz w:val="22"/>
-          <w:szCs w:val="22"/>
-        </w:rPr>
-        <w:t>Green Points</w:t>
-      </w:r>
-      <w:r>
-        <w:rPr>
-          <w:rFonts w:ascii="Arial" w:hAnsi="Arial" w:cs="Arial"/>
-          <w:sz w:val="22"/>
-          <w:szCs w:val="22"/>
-        </w:rPr>
-        <w:t xml:space="preserve"> system may further encourage participation by recognising eligible recycling and reuse activities after their outcomes have been verified by an authorised party. Over time, these records could help evaluate participation and environmental outcomes.</w:t>
+        <w:t>Its proposed eco-rewards system may further encourage participation by recognising eligible recycling and reuse activities after their outcomes have been verified by an authorised party. Over time, these records could help evaluate participation and environmental outcomes.</w:t>
       </w:r>
     </w:p>
     <w:p>

</xml_diff>